<commit_message>
Add Module4 draft and updated documents
</commit_message>
<xml_diff>
--- a/Documents/3.1_ADS508 Data Science Design Document_Assignment.docx
+++ b/Documents/3.1_ADS508 Data Science Design Document_Assignment.docx
@@ -887,13 +887,7 @@
         <w:rPr>
           <w:lang w:eastAsia="ko-KR"/>
         </w:rPr>
-        <w:t xml:space="preserve">first few columns contain information about each metro area such as region name and </w:t>
-      </w:r>
-      <w:r>
-        <w:rPr>
-          <w:lang w:eastAsia="ko-KR"/>
-        </w:rPr>
-        <w:t>state. We</w:t>
+        <w:t>first few columns contain information about each metro area such as region name and state. We</w:t>
       </w:r>
       <w:r>
         <w:rPr>
@@ -945,19 +939,7 @@
         <w:rPr>
           <w:lang w:eastAsia="ko-KR"/>
         </w:rPr>
-        <w:t xml:space="preserve">values. This helped us quickly see that housing prices vary across </w:t>
-      </w:r>
-      <w:r>
-        <w:rPr>
-          <w:lang w:eastAsia="ko-KR"/>
-        </w:rPr>
-        <w:t>regions. At</w:t>
-      </w:r>
-      <w:r>
-        <w:rPr>
-          <w:lang w:eastAsia="ko-KR"/>
-        </w:rPr>
-        <w:t xml:space="preserve"> this stage the goal</w:t>
+        <w:t>values. This helped us quickly see that housing prices vary across regions. At this stage the goal</w:t>
       </w:r>
       <w:r>
         <w:rPr>
@@ -1015,15 +997,14 @@
     <w:p>
       <w:pPr>
         <w:rPr>
+          <w:lang w:eastAsia="ko-KR"/>
+        </w:rPr>
+      </w:pPr>
+      <w:r>
+        <w:rPr>
           <w:rFonts w:hint="eastAsia"/>
           <w:lang w:eastAsia="ko-KR"/>
         </w:rPr>
-      </w:pPr>
-      <w:r>
-        <w:rPr>
-          <w:rFonts w:hint="eastAsia"/>
-          <w:lang w:eastAsia="ko-KR"/>
-        </w:rPr>
         <w:t>The following example code was implemented in a SageMaker Studio notebook to ingest and explore the Zillow dataset stored in Amazon S3</w:t>
       </w:r>
     </w:p>
@@ -1035,6 +1016,7 @@
       </w:pPr>
       <w:r>
         <w:rPr>
+          <w:noProof/>
           <w:lang w:eastAsia="ko-KR"/>
         </w:rPr>
         <w:drawing>
@@ -1392,13 +1374,7 @@
     </w:p>
     <w:p>
       <w:r>
-        <w:t xml:space="preserve">The datasets used in this project do not contain protected health information or </w:t>
-      </w:r>
-      <w:r>
-        <w:t>personal</w:t>
-      </w:r>
-      <w:r>
-        <w:t xml:space="preserve"> identifiable information. The Zillow datasets represent aggregated housing market data and do not include records tied to individual homeowners or buyers.</w:t>
+        <w:t>The datasets used in this project do not contain protected health information or personal identifiable information. The Zillow datasets represent aggregated housing market data and do not include records tied to individual homeowners or buyers.</w:t>
       </w:r>
     </w:p>
     <w:p/>
@@ -1578,7 +1554,7 @@
 <w15:commentsEx xmlns:wpc="http://schemas.microsoft.com/office/word/2010/wordprocessingCanvas" xmlns:cx="http://schemas.microsoft.com/office/drawing/2014/chartex" xmlns:cx1="http://schemas.microsoft.com/office/drawing/2015/9/8/chartex" xmlns:cx2="http://schemas.microsoft.com/office/drawing/2015/10/21/chartex" xmlns:cx3="http://schemas.microsoft.com/office/drawing/2016/5/9/chartex" xmlns:cx4="http://schemas.microsoft.com/office/drawing/2016/5/10/chartex" xmlns:cx5="http://schemas.microsoft.com/office/drawing/2016/5/11/chartex" xmlns:cx6="http://schemas.microsoft.com/office/drawing/2016/5/12/chartex" xmlns:cx7="http://schemas.microsoft.com/office/drawing/2016/5/13/chartex" xmlns:cx8="http://schemas.microsoft.com/office/drawing/2016/5/14/chartex" xmlns:mc="http://schemas.openxmlformats.org/markup-compatibility/2006" xmlns:aink="http://schemas.microsoft.com/office/drawing/2016/ink" xmlns:am3d="http://schemas.microsoft.com/office/drawing/2017/model3d" xmlns:o="urn:schemas-microsoft-com:office:office" xmlns:oel="http://schemas.microsoft.com/office/2019/extlst" xmlns:r="http://schemas.openxmlformats.org/officeDocument/2006/relationships" xmlns:m="http://schemas.openxmlformats.org/officeDocument/2006/math" xmlns:v="urn:schemas-microsoft-com:vml" xmlns:wp14="http://schemas.microsoft.com/office/word/2010/wordprocessingDrawing" xmlns:wp="http://schemas.openxmlformats.org/drawingml/2006/wordprocessingDrawing" xmlns:w10="urn:schemas-microsoft-com:office:word" xmlns:w="http://schemas.openxmlformats.org/wordprocessingml/2006/main" xmlns:w14="http://schemas.microsoft.com/office/word/2010/wordml" xmlns:w15="http://schemas.microsoft.com/office/word/2012/wordml" xmlns:w16cex="http://schemas.microsoft.com/office/word/2018/wordml/cex" xmlns:w16cid="http://schemas.microsoft.com/office/word/2016/wordml/cid" xmlns:w16="http://schemas.microsoft.com/office/word/2018/wordml" xmlns:w16du="http://schemas.microsoft.com/office/word/2023/wordml/word16du" xmlns:w16sdtdh="http://schemas.microsoft.com/office/word/2020/wordml/sdtdatahash" xmlns:w16sdtfl="http://schemas.microsoft.com/office/word/2024/wordml/sdtformatlock" xmlns:w16se="http://schemas.microsoft.com/office/word/2015/wordml/symex" xmlns:wpg="http://schemas.microsoft.com/office/word/2010/wordprocessingGroup" xmlns:wpi="http://schemas.microsoft.com/office/word/2010/wordprocessingInk" xmlns:wne="http://schemas.microsoft.com/office/word/2006/wordml" xmlns:wps="http://schemas.microsoft.com/office/word/2010/wordprocessingShape" mc:Ignorable="w14 w15 w16se w16cid w16 w16cex w16sdtdh w16sdtfl w16du wp14">
   <w15:commentEx w15:paraId="5561A2A4" w15:done="0"/>
   <w15:commentEx w15:paraId="4E23440E" w15:done="0"/>
-  <w15:commentEx w15:paraId="566A9DAA" w15:done="0"/>
+  <w15:commentEx w15:paraId="566A9DAA" w15:done="1"/>
   <w15:commentEx w15:paraId="0F483B6B" w15:done="0"/>
 </w15:commentsEx>
 </file>
@@ -3435,6 +3411,7 @@
   <w:style w:type="character" w:default="1" w:styleId="DefaultParagraphFont">
     <w:name w:val="Default Paragraph Font"/>
     <w:uiPriority w:val="1"/>
+    <w:semiHidden/>
     <w:unhideWhenUsed/>
   </w:style>
   <w:style w:type="table" w:default="1" w:styleId="TableNormal">

</xml_diff>